<commit_message>
Name the model, in both AI statements and in the reply
MDPI asked which version of Claude was used after the round-1 revision. Both
statements said only "Claude, Anthropic", which invites the same question again,
so both now name Claude Opus 5.

The version is a fact about the sessions rather than a recollection: the
transcripts under ~/.claude/projects record claude-opus-5 for the ctsegdose work
of 3-7 August and for the round-1 and round-2 revisions of 26-28 August, and no
line mentioning ctsegdose or tomography-4516935 belongs to any other model. No
usage dates are stated in the manuscript, because a round-3 revision would
extend them and a stale date is worse than none; the period is in this commit
and can be given in correspondence.

The test now requires a version to be named, requires both statements to name
the same one, and matches on flattened text -- it failed on the rewrap that
naming the model caused, which is the failure mode the module docstring warns
about.
</commit_message>
<xml_diff>
--- a/paper/manuscript_tomography_revised_highlighted.docx
+++ b/paper/manuscript_tomography_revised_highlighted.docx
@@ -3960,103 +3960,103 @@
         <w:rPr>
           <w:highlight w:val="yellow"/>
         </w:rPr>
-        <w:t xml:space="preserve">A generative artificial intelligence assistant (Claude, Anthropic) was used as a tool in</w:t>
-      </w:r>
-      <w:r>
-        <w:rPr>
-          <w:highlight w:val="yellow"/>
-        </w:rPr>
-        <w:t xml:space="preserve"> </w:t>
-      </w:r>
-      <w:r>
-        <w:rPr>
-          <w:highlight w:val="yellow"/>
-        </w:rPr>
-        <w:t xml:space="preserve">developing the software described in Sections 2.1 to 2.12 and in drafting and editing the</w:t>
-      </w:r>
-      <w:r>
-        <w:rPr>
-          <w:highlight w:val="yellow"/>
-        </w:rPr>
-        <w:t xml:space="preserve"> </w:t>
-      </w:r>
-      <w:r>
-        <w:rPr>
-          <w:highlight w:val="yellow"/>
-        </w:rPr>
-        <w:t xml:space="preserve">text of this manuscript. It was not used to generate, impute or select any reported value.</w:t>
-      </w:r>
-      <w:r>
-        <w:rPr>
-          <w:highlight w:val="yellow"/>
-        </w:rPr>
-        <w:t xml:space="preserve"> </w:t>
-      </w:r>
-      <w:r>
-        <w:rPr>
-          <w:highlight w:val="yellow"/>
-        </w:rPr>
-        <w:t xml:space="preserve">Every number in this article is produced by executable code in the cited repository, is</w:t>
-      </w:r>
-      <w:r>
-        <w:rPr>
-          <w:highlight w:val="yellow"/>
-        </w:rPr>
-        <w:t xml:space="preserve"> </w:t>
-      </w:r>
-      <w:r>
-        <w:rPr>
-          <w:highlight w:val="yellow"/>
-        </w:rPr>
-        <w:t xml:space="preserve">re-derived from the per-series records by the automated test suite described above, and</w:t>
-      </w:r>
-      <w:r>
-        <w:rPr>
-          <w:highlight w:val="yellow"/>
-        </w:rPr>
-        <w:t xml:space="preserve"> </w:t>
-      </w:r>
-      <w:r>
-        <w:rPr>
-          <w:highlight w:val="yellow"/>
-        </w:rPr>
-        <w:t xml:space="preserve">was verified by the author against the underlying records. The study design, the</w:t>
-      </w:r>
-      <w:r>
-        <w:rPr>
-          <w:highlight w:val="yellow"/>
-        </w:rPr>
-        <w:t xml:space="preserve"> </w:t>
-      </w:r>
-      <w:r>
-        <w:rPr>
-          <w:highlight w:val="yellow"/>
-        </w:rPr>
-        <w:t xml:space="preserve">eligibility rules, the quality-control criteria and all scientific judgements,</w:t>
-      </w:r>
-      <w:r>
-        <w:rPr>
-          <w:highlight w:val="yellow"/>
-        </w:rPr>
-        <w:t xml:space="preserve"> </w:t>
-      </w:r>
-      <w:r>
-        <w:rPr>
-          <w:highlight w:val="yellow"/>
-        </w:rPr>
-        <w:t xml:space="preserve">interpretations and conclusions are the author’s, who takes full responsibility for the</w:t>
-      </w:r>
-      <w:r>
-        <w:rPr>
-          <w:highlight w:val="yellow"/>
-        </w:rPr>
-        <w:t xml:space="preserve"> </w:t>
-      </w:r>
-      <w:r>
-        <w:rPr>
-          <w:highlight w:val="yellow"/>
-        </w:rPr>
-        <w:t xml:space="preserve">content of this article.</w:t>
+        <w:t xml:space="preserve">A generative artificial intelligence assistant (Claude Opus 5, Anthropic) was used as a</w:t>
+      </w:r>
+      <w:r>
+        <w:rPr>
+          <w:highlight w:val="yellow"/>
+        </w:rPr>
+        <w:t xml:space="preserve"> </w:t>
+      </w:r>
+      <w:r>
+        <w:rPr>
+          <w:highlight w:val="yellow"/>
+        </w:rPr>
+        <w:t xml:space="preserve">tool in developing the software described in Sections 2.1 to 2.12 and in drafting and</w:t>
+      </w:r>
+      <w:r>
+        <w:rPr>
+          <w:highlight w:val="yellow"/>
+        </w:rPr>
+        <w:t xml:space="preserve"> </w:t>
+      </w:r>
+      <w:r>
+        <w:rPr>
+          <w:highlight w:val="yellow"/>
+        </w:rPr>
+        <w:t xml:space="preserve">editing the text of this manuscript. It was not used to generate, impute or select any</w:t>
+      </w:r>
+      <w:r>
+        <w:rPr>
+          <w:highlight w:val="yellow"/>
+        </w:rPr>
+        <w:t xml:space="preserve"> </w:t>
+      </w:r>
+      <w:r>
+        <w:rPr>
+          <w:highlight w:val="yellow"/>
+        </w:rPr>
+        <w:t xml:space="preserve">reported value. Every number in this article is produced by executable code in the cited</w:t>
+      </w:r>
+      <w:r>
+        <w:rPr>
+          <w:highlight w:val="yellow"/>
+        </w:rPr>
+        <w:t xml:space="preserve"> </w:t>
+      </w:r>
+      <w:r>
+        <w:rPr>
+          <w:highlight w:val="yellow"/>
+        </w:rPr>
+        <w:t xml:space="preserve">repository, is re-derived from the per-series records by the automated test suite</w:t>
+      </w:r>
+      <w:r>
+        <w:rPr>
+          <w:highlight w:val="yellow"/>
+        </w:rPr>
+        <w:t xml:space="preserve"> </w:t>
+      </w:r>
+      <w:r>
+        <w:rPr>
+          <w:highlight w:val="yellow"/>
+        </w:rPr>
+        <w:t xml:space="preserve">described above, and was verified by the author against the underlying records. The</w:t>
+      </w:r>
+      <w:r>
+        <w:rPr>
+          <w:highlight w:val="yellow"/>
+        </w:rPr>
+        <w:t xml:space="preserve"> </w:t>
+      </w:r>
+      <w:r>
+        <w:rPr>
+          <w:highlight w:val="yellow"/>
+        </w:rPr>
+        <w:t xml:space="preserve">study design, the eligibility rules, the quality-control criteria and all scientific</w:t>
+      </w:r>
+      <w:r>
+        <w:rPr>
+          <w:highlight w:val="yellow"/>
+        </w:rPr>
+        <w:t xml:space="preserve"> </w:t>
+      </w:r>
+      <w:r>
+        <w:rPr>
+          <w:highlight w:val="yellow"/>
+        </w:rPr>
+        <w:t xml:space="preserve">judgements, interpretations and conclusions are the author’s, who takes full</w:t>
+      </w:r>
+      <w:r>
+        <w:rPr>
+          <w:highlight w:val="yellow"/>
+        </w:rPr>
+        <w:t xml:space="preserve"> </w:t>
+      </w:r>
+      <w:r>
+        <w:rPr>
+          <w:highlight w:val="yellow"/>
+        </w:rPr>
+        <w:t xml:space="preserve">responsibility for the content of this article.</w:t>
       </w:r>
     </w:p>
     <w:bookmarkEnd w:id="27"/>
@@ -7356,37 +7356,82 @@
         <w:pStyle w:val="FirstParagraph"/>
       </w:pPr>
       <w:r>
-        <w:t xml:space="preserve">A generative artificial intelligence assistant (Claude, Anthropic) was used as a tool in</w:t>
-      </w:r>
-      <w:r>
-        <w:t xml:space="preserve"> </w:t>
-      </w:r>
-      <w:r>
-        <w:t xml:space="preserve">the development of the software and in drafting and editing the text of this manuscript.</w:t>
-      </w:r>
-      <w:r>
-        <w:t xml:space="preserve"> </w:t>
-      </w:r>
-      <w:r>
-        <w:t xml:space="preserve">All reported results are produced by executable code contained in the cited repository,</w:t>
-      </w:r>
-      <w:r>
-        <w:t xml:space="preserve"> </w:t>
-      </w:r>
-      <w:r>
-        <w:t xml:space="preserve">are re-derived from the underlying per-series records by an automated test suite, and were</w:t>
-      </w:r>
-      <w:r>
-        <w:t xml:space="preserve"> </w:t>
-      </w:r>
-      <w:r>
-        <w:t xml:space="preserve">verified by the author. All scientific judgements, interpretations and conclusions are the</w:t>
-      </w:r>
-      <w:r>
-        <w:t xml:space="preserve"> </w:t>
-      </w:r>
-      <w:r>
-        <w:t xml:space="preserve">author’s, who takes full responsibility for the content of this article.</w:t>
+        <w:rPr>
+          <w:highlight w:val="yellow"/>
+        </w:rPr>
+        <w:t xml:space="preserve">A generative artificial intelligence assistant (Claude Opus 5, Anthropic) was used as a</w:t>
+      </w:r>
+      <w:r>
+        <w:rPr>
+          <w:highlight w:val="yellow"/>
+        </w:rPr>
+        <w:t xml:space="preserve"> </w:t>
+      </w:r>
+      <w:r>
+        <w:rPr>
+          <w:highlight w:val="yellow"/>
+        </w:rPr>
+        <w:t xml:space="preserve">tool in the development of the software and in drafting and editing the text of this</w:t>
+      </w:r>
+      <w:r>
+        <w:rPr>
+          <w:highlight w:val="yellow"/>
+        </w:rPr>
+        <w:t xml:space="preserve"> </w:t>
+      </w:r>
+      <w:r>
+        <w:rPr>
+          <w:highlight w:val="yellow"/>
+        </w:rPr>
+        <w:t xml:space="preserve">manuscript. All reported results are produced by executable code contained in the cited</w:t>
+      </w:r>
+      <w:r>
+        <w:rPr>
+          <w:highlight w:val="yellow"/>
+        </w:rPr>
+        <w:t xml:space="preserve"> </w:t>
+      </w:r>
+      <w:r>
+        <w:rPr>
+          <w:highlight w:val="yellow"/>
+        </w:rPr>
+        <w:t xml:space="preserve">repository, are re-derived from the underlying per-series records by an automated test</w:t>
+      </w:r>
+      <w:r>
+        <w:rPr>
+          <w:highlight w:val="yellow"/>
+        </w:rPr>
+        <w:t xml:space="preserve"> </w:t>
+      </w:r>
+      <w:r>
+        <w:rPr>
+          <w:highlight w:val="yellow"/>
+        </w:rPr>
+        <w:t xml:space="preserve">suite, and were verified by the author. All scientific judgements, interpretations and</w:t>
+      </w:r>
+      <w:r>
+        <w:rPr>
+          <w:highlight w:val="yellow"/>
+        </w:rPr>
+        <w:t xml:space="preserve"> </w:t>
+      </w:r>
+      <w:r>
+        <w:rPr>
+          <w:highlight w:val="yellow"/>
+        </w:rPr>
+        <w:t xml:space="preserve">conclusions are the author’s, who takes full responsibility for the content of this</w:t>
+      </w:r>
+      <w:r>
+        <w:rPr>
+          <w:highlight w:val="yellow"/>
+        </w:rPr>
+        <w:t xml:space="preserve"> </w:t>
+      </w:r>
+      <w:r>
+        <w:rPr>
+          <w:highlight w:val="yellow"/>
+        </w:rPr>
+        <w:t xml:space="preserve">article.</w:t>
       </w:r>
     </w:p>
     <w:bookmarkEnd w:id="59"/>

</xml_diff>